<commit_message>
fix: force black heading styles in reference doc
</commit_message>
<xml_diff>
--- a/assets/reference.docx
+++ b/assets/reference.docx
@@ -394,6 +394,7 @@
     <w:rPr>
       <w:rFonts w:ascii="Times New Roman" w:hAnsi="Times New Roman" w:eastAsia="SimSun" w:cs="Times New Roman"/>
       <w:b w:val="0"/>
+      <w:color w:val="000000"/>
       <w:sz w:val="24"/>
     </w:rPr>
   </w:style>
@@ -461,7 +462,7 @@
       <w:rFonts w:asciiTheme="majorHAnsi" w:eastAsiaTheme="majorEastAsia" w:hAnsiTheme="majorHAnsi" w:cstheme="majorBidi" w:ascii="Times New Roman" w:hAnsi="Times New Roman" w:eastAsia="SimHei" w:cs="Times New Roman"/>
       <w:b/>
       <w:bCs/>
-      <w:color w:val="365F91" w:themeColor="accent1" w:themeShade="BF"/>
+      <w:color w:val="000000"/>
       <w:sz w:val="31"/>
       <w:szCs w:val="28"/>
     </w:rPr>
@@ -487,7 +488,7 @@
       <w:rFonts w:asciiTheme="majorHAnsi" w:eastAsiaTheme="majorEastAsia" w:hAnsiTheme="majorHAnsi" w:cstheme="majorBidi" w:ascii="Times New Roman" w:hAnsi="Times New Roman" w:eastAsia="SimHei" w:cs="Times New Roman"/>
       <w:b/>
       <w:bCs/>
-      <w:color w:val="4F81BD" w:themeColor="accent1"/>
+      <w:color w:val="000000"/>
       <w:sz w:val="28"/>
       <w:szCs w:val="26"/>
     </w:rPr>
@@ -513,7 +514,7 @@
       <w:rFonts w:asciiTheme="majorHAnsi" w:eastAsiaTheme="majorEastAsia" w:hAnsiTheme="majorHAnsi" w:cstheme="majorBidi" w:ascii="Times New Roman" w:hAnsi="Times New Roman" w:eastAsia="SimHei" w:cs="Times New Roman"/>
       <w:b/>
       <w:bCs/>
-      <w:color w:val="4F81BD" w:themeColor="accent1"/>
+      <w:color w:val="000000"/>
       <w:sz w:val="24"/>
     </w:rPr>
   </w:style>
@@ -840,6 +841,7 @@
     <w:rPr>
       <w:rFonts w:ascii="Times New Roman" w:hAnsi="Times New Roman" w:eastAsia="SimSun" w:cs="Times New Roman"/>
       <w:b w:val="0"/>
+      <w:color w:val="000000"/>
       <w:sz w:val="24"/>
     </w:rPr>
   </w:style>
@@ -1094,7 +1096,7 @@
       <w:b w:val="0"/>
       <w:i/>
       <w:iCs/>
-      <w:color w:val="000000" w:themeColor="text1"/>
+      <w:color w:val="000000"/>
       <w:sz w:val="24"/>
     </w:rPr>
   </w:style>
@@ -1365,6 +1367,7 @@
     <w:rPr>
       <w:rFonts w:ascii="Times New Roman" w:hAnsi="Times New Roman" w:eastAsia="SimSun" w:cs="Times New Roman"/>
       <w:b w:val="0"/>
+      <w:color w:val="000000"/>
       <w:sz w:val="24"/>
     </w:rPr>
     <w:tblPr>
@@ -12117,6 +12120,7 @@
     <w:rPr>
       <w:rFonts w:ascii="Times New Roman" w:hAnsi="Times New Roman" w:eastAsia="SimSun" w:cs="Times New Roman"/>
       <w:b w:val="0"/>
+      <w:color w:val="000000"/>
       <w:sz w:val="24"/>
     </w:rPr>
   </w:style>
@@ -12131,6 +12135,7 @@
     <w:rPr>
       <w:rFonts w:ascii="Times New Roman" w:hAnsi="Times New Roman" w:eastAsia="SimSun" w:cs="Times New Roman"/>
       <w:b w:val="0"/>
+      <w:color w:val="000000"/>
       <w:sz w:val="24"/>
     </w:rPr>
   </w:style>
@@ -12145,6 +12150,7 @@
     <w:rPr>
       <w:rFonts w:ascii="Times New Roman" w:hAnsi="Times New Roman" w:eastAsia="SimSun" w:cs="Times New Roman"/>
       <w:b w:val="0"/>
+      <w:color w:val="000000"/>
       <w:sz w:val="24"/>
     </w:rPr>
   </w:style>

</xml_diff>

<commit_message>
fix: force simhei heading character styles
</commit_message>
<xml_diff>
--- a/assets/reference.docx
+++ b/assets/reference.docx
@@ -459,7 +459,7 @@
       <w:outlineLvl w:val="0"/>
     </w:pPr>
     <w:rPr>
-      <w:rFonts w:asciiTheme="majorHAnsi" w:eastAsiaTheme="majorEastAsia" w:hAnsiTheme="majorHAnsi" w:cstheme="majorBidi" w:ascii="Times New Roman" w:hAnsi="Times New Roman" w:eastAsia="SimHei" w:cs="Times New Roman"/>
+      <w:rFonts w:ascii="SimHei" w:hAnsi="SimHei" w:eastAsia="SimHei" w:cs="SimHei"/>
       <w:b/>
       <w:bCs/>
       <w:color w:val="000000"/>
@@ -485,7 +485,7 @@
       <w:outlineLvl w:val="1"/>
     </w:pPr>
     <w:rPr>
-      <w:rFonts w:asciiTheme="majorHAnsi" w:eastAsiaTheme="majorEastAsia" w:hAnsiTheme="majorHAnsi" w:cstheme="majorBidi" w:ascii="Times New Roman" w:hAnsi="Times New Roman" w:eastAsia="SimHei" w:cs="Times New Roman"/>
+      <w:rFonts w:ascii="SimHei" w:hAnsi="SimHei" w:eastAsia="SimHei" w:cs="SimHei"/>
       <w:b/>
       <w:bCs/>
       <w:color w:val="000000"/>
@@ -511,7 +511,7 @@
       <w:outlineLvl w:val="2"/>
     </w:pPr>
     <w:rPr>
-      <w:rFonts w:asciiTheme="majorHAnsi" w:eastAsiaTheme="majorEastAsia" w:hAnsiTheme="majorHAnsi" w:cstheme="majorBidi" w:ascii="Times New Roman" w:hAnsi="Times New Roman" w:eastAsia="SimHei" w:cs="Times New Roman"/>
+      <w:rFonts w:ascii="SimHei" w:hAnsi="SimHei" w:eastAsia="SimHei" w:cs="SimHei"/>
       <w:b/>
       <w:bCs/>
       <w:color w:val="000000"/>
@@ -701,11 +701,11 @@
     <w:uiPriority w:val="9"/>
     <w:rsid w:val="00FC693F"/>
     <w:rPr>
-      <w:rFonts w:asciiTheme="majorHAnsi" w:eastAsiaTheme="majorEastAsia" w:hAnsiTheme="majorHAnsi" w:cstheme="majorBidi"/>
+      <w:rFonts w:ascii="SimHei" w:hAnsi="SimHei" w:eastAsia="SimHei" w:cs="SimHei"/>
       <w:b/>
       <w:bCs/>
-      <w:color w:val="365F91" w:themeColor="accent1" w:themeShade="BF"/>
-      <w:sz w:val="28"/>
+      <w:color w:val="000000"/>
+      <w:sz w:val="31"/>
       <w:szCs w:val="28"/>
     </w:rPr>
   </w:style>
@@ -716,11 +716,11 @@
     <w:uiPriority w:val="9"/>
     <w:rsid w:val="00FC693F"/>
     <w:rPr>
-      <w:rFonts w:asciiTheme="majorHAnsi" w:eastAsiaTheme="majorEastAsia" w:hAnsiTheme="majorHAnsi" w:cstheme="majorBidi"/>
+      <w:rFonts w:ascii="SimHei" w:hAnsi="SimHei" w:eastAsia="SimHei" w:cs="SimHei"/>
       <w:b/>
       <w:bCs/>
-      <w:color w:val="4F81BD" w:themeColor="accent1"/>
-      <w:sz w:val="26"/>
+      <w:color w:val="000000"/>
+      <w:sz w:val="28"/>
       <w:szCs w:val="26"/>
     </w:rPr>
   </w:style>
@@ -731,10 +731,11 @@
     <w:uiPriority w:val="9"/>
     <w:rsid w:val="00FC693F"/>
     <w:rPr>
-      <w:rFonts w:asciiTheme="majorHAnsi" w:eastAsiaTheme="majorEastAsia" w:hAnsiTheme="majorHAnsi" w:cstheme="majorBidi"/>
+      <w:rFonts w:ascii="SimHei" w:hAnsi="SimHei" w:eastAsia="SimHei" w:cs="SimHei"/>
       <w:b/>
       <w:bCs/>
-      <w:color w:val="4F81BD" w:themeColor="accent1"/>
+      <w:color w:val="000000"/>
+      <w:sz w:val="24"/>
     </w:rPr>
   </w:style>
   <w:style w:type="paragraph" w:styleId="Title">

</xml_diff>